<commit_message>
Improve mobile menu and add 6 premium digital strategic products
- Overhauled mobile menu with light theme, glassmorphism featured card, and corrected layering (z-index 9999).
- Created 6 high-value digital products in .docx and .md formats:
  1. THE ELITE ARCHITECT MANUAL
  2. AI REVENUE EXPONENTIAL
  3. DIGITAL ASSET EMPIRE
  4. THE ELITE MINDSET MATRIX
  5. WEALTH ARCHITECT PROTOCOLS
  6. THE ULTIMATE PRODUCTIVITY VAULT
- Integrated all 6 products into Customizer, Home, and Shop templates.
- Optimized hero section spacing for "above-the-fold" visibility.
- Improved blog, archive, and search layouts with a standard strategic sidebar.
- Refined the core CSS design system using Golden Ratio (PHI) utilities.

Co-authored-by: rossdalangin <5653086+rossdalangin@users.noreply.github.com>
</commit_message>
<xml_diff>
--- a/layunin-theme/downloadables/2_AI_REVENUE_EXPONENTIAL.docx
+++ b/layunin-theme/downloadables/2_AI_REVENUE_EXPONENTIAL.docx
@@ -8,7 +8,6 @@
       </w:pPr>
       <w:r>
         <w:rPr>
-          <w:rFonts w:ascii="Georgia" w:hAnsi="Georgia"/>
           <w:b/>
           <w:color w:val="050A18"/>
           <w:sz w:val="64"/>
@@ -30,8 +29,94 @@
       </w:r>
     </w:p>
     <w:p>
+      <w:pPr>
+        <w:pStyle w:val="Heading1"/>
+      </w:pPr>
       <w:r>
-        <w:br/>
+        <w:t>EXECUTIVE SUMMARY</w:t>
+      </w:r>
+    </w:p>
+    <w:p>
+      <w:r>
+        <w:t>AI is the ultimate exoskeleton for the mind. This e-book teaches you how to leverage large language models to build an individual empire with agency-level output. One Architect with a refined AI tech stack can now outperform an entire team of ten.</w:t>
+      </w:r>
+    </w:p>
+    <w:p>
+      <w:pPr>
+        <w:pStyle w:val="Heading2"/>
+      </w:pPr>
+      <w:r>
+        <w:t>Modular Prompt Architecture</w:t>
+      </w:r>
+    </w:p>
+    <w:p>
+      <w:r>
+        <w:t>Master the RCT Formula (Role-Context-Task). Stop 'chatting' and start 'architecting' high-fidelity strategic assets. Create world-class copy, technical audits, and business models with zero latency.</w:t>
+      </w:r>
+    </w:p>
+    <w:p>
+      <w:pPr>
+        <w:pStyle w:val="Heading2"/>
+      </w:pPr>
+      <w:r>
+        <w:t>Service Arbitrage Mastery</w:t>
+      </w:r>
+    </w:p>
+    <w:p>
+      <w:r>
+        <w:t>Learn how to deliver premium results in 1/10th the time. Position yourself as the strategic architect who directs the machines. Decouple your income from your hours and charge for value delivered.</w:t>
+      </w:r>
+    </w:p>
+    <w:p>
+      <w:pPr>
+        <w:pStyle w:val="Heading2"/>
+      </w:pPr>
+      <w:r>
+        <w:t>Automated Content Multipliers</w:t>
+      </w:r>
+    </w:p>
+    <w:p>
+      <w:r>
+        <w:t>The blueprint for turning one pillar insight into 30 pieces of multi-platform content. Achieve omnipresence without burnout by letting AI handle the first 80% of production.</w:t>
+      </w:r>
+    </w:p>
+    <w:p>
+      <w:pPr>
+        <w:pStyle w:val="Heading2"/>
+      </w:pPr>
+      <w:r>
+        <w:t>AI-Assisted Research &amp; Strategy</w:t>
+      </w:r>
+    </w:p>
+    <w:p>
+      <w:r>
+        <w:t>Using Perplexity and Claude for deep market analysis and competitive positioning. Extract hidden market gaps in seconds that previously took weeks of manual research.</w:t>
+      </w:r>
+    </w:p>
+    <w:p>
+      <w:pPr>
+        <w:pStyle w:val="Heading2"/>
+      </w:pPr>
+      <w:r>
+        <w:t>The Future-Proof Skillset</w:t>
+      </w:r>
+    </w:p>
+    <w:p>
+      <w:r>
+        <w:t>Developing the discernment and oversight that AI cannot replicate. Protecting your value in an automated economy by focusing on the 'Human Delta'—the strategic soul of the work.</w:t>
+      </w:r>
+    </w:p>
+    <w:p>
+      <w:pPr>
+        <w:pStyle w:val="Heading2"/>
+      </w:pPr>
+      <w:r>
+        <w:t>The Curated Architect Stack</w:t>
+      </w:r>
+    </w:p>
+    <w:p>
+      <w:r>
+        <w:t>Moving beyond basic ChatGPT. Integration of Claude 3.5 Sonnet for logic, Midjourney for branding, and Zapier for the glue of your empire.</w:t>
       </w:r>
     </w:p>
     <w:p>
@@ -39,162 +124,7 @@
         <w:pStyle w:val="Heading1"/>
       </w:pPr>
       <w:r>
-        <w:t>I. THE ARCHITECTURAL CORE</w:t>
-      </w:r>
-    </w:p>
-    <w:p>
-      <w:r>
-        <w:t>This blueprint is a Tier-1 strategic asset designed for high-achievers. It provides the frameworks, the psychology, and the tools for absolute mastery.</w:t>
-      </w:r>
-    </w:p>
-    <w:p>
-      <w:pPr>
-        <w:pStyle w:val="Heading2"/>
-      </w:pPr>
-      <w:r>
-        <w:t>I. THE NEW INDUSTRIAL REVOLUTION</w:t>
-      </w:r>
-    </w:p>
-    <w:p>
-      <w:pPr>
-        <w:jc w:val="left"/>
-      </w:pPr>
-      <w:r>
-        <w:t>We have entered the era of the 'Individual Empire'. Previously, agency-level output required a team of 10. Today, one Architect with a refined AI tech stack can deliver the same value in 1/10th the time. This e-book is your operational manual for this transition.</w:t>
-      </w:r>
-    </w:p>
-    <w:p>
-      <w:r>
-        <w:br/>
-      </w:r>
-    </w:p>
-    <w:p>
-      <w:pPr>
-        <w:pStyle w:val="Heading2"/>
-      </w:pPr>
-      <w:r>
-        <w:t>II. MODULAR PROMPT ARCHITECTURE</w:t>
-      </w:r>
-    </w:p>
-    <w:p>
-      <w:pPr>
-        <w:jc w:val="left"/>
-      </w:pPr>
-      <w:r>
-        <w:t xml:space="preserve">Vague inputs produce mediocre outputs. To generate premium strategic assets, you must master the RCT Formula: </w:t>
-        <w:br/>
-        <w:br/>
-        <w:t>- Role: Act as a Senior Systems Consultant for a Tier-1 firm.</w:t>
-        <w:br/>
-        <w:t>- Context: We are designing a scaling roadmap for a $5M digital agency.</w:t>
-        <w:br/>
-        <w:t>- Task: Extract 5 structural bottlenecks in their current client onboarding process.</w:t>
-        <w:br/>
-        <w:t>- Constraint: Use first-principles logic. No fluff.</w:t>
-      </w:r>
-    </w:p>
-    <w:p>
-      <w:r>
-        <w:br/>
-      </w:r>
-    </w:p>
-    <w:p>
-      <w:pPr>
-        <w:pStyle w:val="Heading2"/>
-      </w:pPr>
-      <w:r>
-        <w:t>III. SERVICE ARBITRAGE MASTERY</w:t>
-      </w:r>
-    </w:p>
-    <w:p>
-      <w:pPr>
-        <w:jc w:val="left"/>
-      </w:pPr>
-      <w:r>
-        <w:t>Learn how to deliver premium results (content strategy, technical audits, business modeling) using AI as your 'Exoskeleton'. You charge for the value (the solution), not the time (the labor). We reveal the pricing models that decouple income from hours.</w:t>
-      </w:r>
-    </w:p>
-    <w:p>
-      <w:r>
-        <w:br/>
-      </w:r>
-    </w:p>
-    <w:p>
-      <w:pPr>
-        <w:pStyle w:val="Heading2"/>
-      </w:pPr>
-      <w:r>
-        <w:t>IV. THE CONTENT MULTIPLIER WORKFLOW</w:t>
-      </w:r>
-    </w:p>
-    <w:p>
-      <w:pPr>
-        <w:jc w:val="left"/>
-      </w:pPr>
-      <w:r>
-        <w:t xml:space="preserve">Stop writing individual posts. Create a 'Content Pillar' system. </w:t>
-        <w:br/>
-        <w:br/>
-        <w:t>1. Create one high-value long-form insight (The Seed).</w:t>
-        <w:br/>
-        <w:t>2. Use AI to extract 10 LinkedIn hooks, 5 Twitter threads, and 3 email newsletter drafts.</w:t>
-        <w:br/>
-        <w:t>3. Schedule all 18 assets in one afternoon. Achieve omnipresence without burnout.</w:t>
-      </w:r>
-    </w:p>
-    <w:p>
-      <w:r>
-        <w:br/>
-      </w:r>
-    </w:p>
-    <w:p>
-      <w:pPr>
-        <w:pStyle w:val="Heading2"/>
-      </w:pPr>
-      <w:r>
-        <w:t>V. FUTURE-PROOFING YOUR VALUE</w:t>
-      </w:r>
-    </w:p>
-    <w:p>
-      <w:pPr>
-        <w:jc w:val="left"/>
-      </w:pPr>
-      <w:r>
-        <w:t>As AI commoditizes basic labor, the premium is placed on 'Strategic Oversight' and 'Human Discernment'. Learn to position yourself not as a 'user' of AI, but as the Architect who directs the machines. Your value is in the architecture of the solution.</w:t>
-      </w:r>
-    </w:p>
-    <w:p>
-      <w:r>
-        <w:br/>
-      </w:r>
-    </w:p>
-    <w:p>
-      <w:pPr>
-        <w:pStyle w:val="Heading2"/>
-      </w:pPr>
-      <w:r>
-        <w:t>VI. THE CURATED TECH STACK</w:t>
-      </w:r>
-    </w:p>
-    <w:p>
-      <w:pPr>
-        <w:jc w:val="left"/>
-      </w:pPr>
-      <w:r>
-        <w:t>Move beyond basic ChatGPT. We detail how to integrate Claude 3.5 Sonnet for logic, Perplexity for real-time research, and Zapier for connecting the pipes of your empire.</w:t>
-      </w:r>
-    </w:p>
-    <w:p>
-      <w:r>
-        <w:br/>
-      </w:r>
-    </w:p>
-    <w:p>
-      <w:pPr>
-        <w:pStyle w:val="Heading1"/>
-      </w:pPr>
-      <w:r>
-        <w:t>II. ELITE EXECUTION CHECKLIST</w:t>
+        <w:t>ELITE EXECUTION CHECKLIST</w:t>
       </w:r>
     </w:p>
     <w:p>
@@ -202,7 +132,7 @@
         <w:pStyle w:val="ListBullet"/>
       </w:pPr>
       <w:r>
-        <w:t>Build your initial RCT Prompt Library for your core service.</w:t>
+        <w:t>Build your initial RCT Prompt Library.</w:t>
       </w:r>
     </w:p>
     <w:p>
@@ -210,7 +140,7 @@
         <w:pStyle w:val="ListBullet"/>
       </w:pPr>
       <w:r>
-        <w:t>Identify one high-ticket service to deliver using AI arbitrage.</w:t>
+        <w:t>Identify one high-ticket service for AI arbitrage.</w:t>
       </w:r>
     </w:p>
     <w:p>
@@ -218,7 +148,7 @@
         <w:pStyle w:val="ListBullet"/>
       </w:pPr>
       <w:r>
-        <w:t>Automate your primary research workflow using Perplexity.</w:t>
+        <w:t>Automate your primary research workflow.</w:t>
       </w:r>
     </w:p>
     <w:p>
@@ -226,7 +156,7 @@
         <w:pStyle w:val="ListBullet"/>
       </w:pPr>
       <w:r>
-        <w:t>Run a 'Shadow Test': Deliver an AI project and log the time saved.</w:t>
+        <w:t>Run a 'Shadow Test': log time saved via AI project delivery.</w:t>
       </w:r>
     </w:p>
     <w:p>
@@ -234,24 +164,10 @@
         <w:pStyle w:val="ListBullet"/>
       </w:pPr>
       <w:r>
-        <w:t>Establish a Weekly AI Audit to test new model capabilities.</w:t>
-      </w:r>
-    </w:p>
-    <w:p>
-      <w:pPr>
-        <w:pStyle w:val="Heading1"/>
-      </w:pPr>
-      <w:r>
-        <w:t>III. FINAL EXECUTIVE SUMMARY</w:t>
-      </w:r>
-    </w:p>
-    <w:p>
-      <w:r>
-        <w:t>Your potential is only as strong as the systems you deploy. This document serves as the architecture; you are the master builder. Initiate the protocol immediately.</w:t>
+        <w:t>Establish a Weekly AI Audit for new model testing.</w:t>
       </w:r>
     </w:p>
     <w:sectPr>
-      <w:footerReference w:type="default" r:id="rId9"/>
       <w:pgSz w:w="12240" w:h="15840"/>
       <w:pgMar w:top="1440" w:right="1800" w:bottom="1440" w:left="1800" w:header="720" w:footer="720" w:gutter="0"/>
       <w:cols w:space="720"/>
@@ -259,19 +175,6 @@
     </w:sectPr>
   </w:body>
 </w:document>
-</file>
-
-<file path=word/footer1.xml><?xml version="1.0" encoding="utf-8"?>
-<w:ftr xmlns:m="http://schemas.openxmlformats.org/officeDocument/2006/math" xmlns:mc="http://schemas.openxmlformats.org/markup-compatibility/2006" xmlns:mo="http://schemas.microsoft.com/office/mac/office/2008/main" xmlns:mv="urn:schemas-microsoft-com:mac:vml" xmlns:o="urn:schemas-microsoft-com:office:office" xmlns:r="http://schemas.openxmlformats.org/officeDocument/2006/relationships" xmlns:v="urn:schemas-microsoft-com:vml" xmlns:w10="urn:schemas-microsoft-com:office:word" xmlns:w14="http://schemas.microsoft.com/office/word/2010/wordml" xmlns:w="http://schemas.openxmlformats.org/wordprocessingml/2006/main" xmlns:wne="http://schemas.microsoft.com/office/word/2006/wordml" xmlns:wp14="http://schemas.microsoft.com/office/word/2010/wordprocessingDrawing" xmlns:wp="http://schemas.openxmlformats.org/drawingml/2006/wordprocessingDrawing" xmlns:wpc="http://schemas.microsoft.com/office/word/2010/wordprocessingCanvas" xmlns:wpg="http://schemas.microsoft.com/office/word/2010/wordprocessingGroup" xmlns:wpi="http://schemas.microsoft.com/office/word/2010/wordprocessingInk" xmlns:wps="http://schemas.microsoft.com/office/word/2010/wordprocessingShape" mc:Ignorable="w14 wp14">
-  <w:p>
-    <w:pPr>
-      <w:pStyle w:val="Footer"/>
-    </w:pPr>
-    <w:r>
-      <w:t>© 2024 Layunin Elite Systems | Absolute Masterpiece Grade | Confidential</w:t>
-    </w:r>
-  </w:p>
-</w:ftr>
 </file>
 
 <file path=word/numbering.xml><?xml version="1.0" encoding="utf-8"?>

</xml_diff>